<commit_message>
Added the time taken graph and made some changes to the db
</commit_message>
<xml_diff>
--- a/Graphs/Graphs.docx
+++ b/Graphs/Graphs.docx
@@ -872,6 +872,151 @@
           <w:szCs w:val="24"/>
         </w:rPr>
         <w:t xml:space="preserve"> (distance from neutrality) is likely a more appropriate choice. It emphasizes the shift in strong opinions, which are typically harder to change and thus more significant from a persuasion standpoint.</w:t>
+      </w:r>
+    </w:p>
+    <w:p>
+      <w:pPr>
+        <w:rPr>
+          <w:rFonts w:cstheme="minorHAnsi"/>
+          <w:sz w:val="28"/>
+          <w:szCs w:val="24"/>
+        </w:rPr>
+      </w:pPr>
+    </w:p>
+    <w:p>
+      <w:pPr>
+        <w:rPr>
+          <w:rFonts w:cstheme="minorHAnsi"/>
+          <w:sz w:val="28"/>
+          <w:szCs w:val="24"/>
+        </w:rPr>
+      </w:pPr>
+    </w:p>
+    <w:p>
+      <w:pPr>
+        <w:rPr>
+          <w:rFonts w:cstheme="minorHAnsi"/>
+          <w:sz w:val="28"/>
+          <w:szCs w:val="24"/>
+        </w:rPr>
+      </w:pPr>
+    </w:p>
+    <w:p>
+      <w:pPr>
+        <w:rPr>
+          <w:rFonts w:cstheme="minorHAnsi"/>
+          <w:sz w:val="28"/>
+          <w:szCs w:val="24"/>
+        </w:rPr>
+      </w:pPr>
+      <w:r>
+        <w:rPr>
+          <w:rFonts w:cstheme="minorHAnsi"/>
+          <w:sz w:val="28"/>
+          <w:szCs w:val="24"/>
+        </w:rPr>
+        <w:lastRenderedPageBreak/>
+        <w:t>Inferences from the graphs:</w:t>
+      </w:r>
+    </w:p>
+    <w:p>
+      <w:pPr>
+        <w:rPr>
+          <w:rFonts w:cstheme="minorHAnsi"/>
+          <w:sz w:val="28"/>
+          <w:szCs w:val="24"/>
+        </w:rPr>
+      </w:pPr>
+      <w:r>
+        <w:rPr>
+          <w:rFonts w:cstheme="minorHAnsi"/>
+          <w:sz w:val="28"/>
+          <w:szCs w:val="24"/>
+        </w:rPr>
+        <w:t>1.Arg vs Arg LLM – Pretty unexpected results</w:t>
+      </w:r>
+      <w:r>
+        <w:rPr>
+          <w:rFonts w:cstheme="minorHAnsi"/>
+          <w:sz w:val="28"/>
+          <w:szCs w:val="24"/>
+        </w:rPr>
+        <w:t>(arg having more avg change in opinion than arg LLM)</w:t>
+      </w:r>
+      <w:r>
+        <w:rPr>
+          <w:rFonts w:cstheme="minorHAnsi"/>
+          <w:sz w:val="28"/>
+          <w:szCs w:val="24"/>
+        </w:rPr>
+        <w:t xml:space="preserve">. Can only be explained by </w:t>
+      </w:r>
+      <w:r>
+        <w:rPr>
+          <w:rFonts w:cstheme="minorHAnsi"/>
+          <w:sz w:val="28"/>
+          <w:szCs w:val="24"/>
+        </w:rPr>
+        <w:t>a lack a more data and the presence of outliers like +4 and +5 difference in ratings in case of arg(2 instances of each) while for arg LLM there were only 2 cases of +4.</w:t>
+      </w:r>
+    </w:p>
+    <w:p>
+      <w:pPr>
+        <w:rPr>
+          <w:rFonts w:cstheme="minorHAnsi"/>
+          <w:sz w:val="28"/>
+          <w:szCs w:val="24"/>
+        </w:rPr>
+      </w:pPr>
+      <w:r>
+        <w:rPr>
+          <w:rFonts w:cstheme="minorHAnsi"/>
+          <w:sz w:val="28"/>
+          <w:szCs w:val="24"/>
+        </w:rPr>
+        <w:t>Also,number of rows for Arg LLM was 42 while for arg it was 39. Slight disparity could’ve lowered the average for arg llm.</w:t>
+      </w:r>
+    </w:p>
+    <w:p>
+      <w:pPr>
+        <w:rPr>
+          <w:rFonts w:cstheme="minorHAnsi"/>
+          <w:sz w:val="28"/>
+          <w:szCs w:val="24"/>
+        </w:rPr>
+      </w:pPr>
+      <w:r>
+        <w:rPr>
+          <w:rFonts w:cstheme="minorHAnsi"/>
+          <w:sz w:val="28"/>
+          <w:szCs w:val="24"/>
+        </w:rPr>
+        <w:t xml:space="preserve">Maybe arg LLM having a nuanced response on certain topics(particularly the non-anthropic ones) might’ve caused the </w:t>
+      </w:r>
+      <w:r>
+        <w:rPr>
+          <w:rFonts w:cstheme="minorHAnsi"/>
+          <w:sz w:val="28"/>
+          <w:szCs w:val="24"/>
+        </w:rPr>
+        <w:t>more number of negative change in opinions.</w:t>
+      </w:r>
+    </w:p>
+    <w:p>
+      <w:pPr>
+        <w:rPr>
+          <w:rFonts w:cstheme="minorHAnsi"/>
+          <w:sz w:val="28"/>
+          <w:szCs w:val="24"/>
+        </w:rPr>
+      </w:pPr>
+      <w:r>
+        <w:rPr>
+          <w:rFonts w:cstheme="minorHAnsi"/>
+          <w:sz w:val="28"/>
+          <w:szCs w:val="24"/>
+        </w:rPr>
+        <w:t>2.</w:t>
       </w:r>
     </w:p>
     <w:p>
@@ -1873,6 +2018,7 @@
   <w:style w:type="character" w:default="1" w:styleId="DefaultParagraphFont">
     <w:name w:val="Default Paragraph Font"/>
     <w:uiPriority w:val="1"/>
+    <w:semiHidden/>
     <w:unhideWhenUsed/>
   </w:style>
   <w:style w:type="table" w:default="1" w:styleId="TableNormal">

</xml_diff>